<commit_message>
Programmazione: capitoli 9-12 (referenziamento, scanf, puntatori, dereferenziamento); supporto a blocchi di codice e corsivo ~ nello script
</commit_message>
<xml_diff>
--- a/Programmazione/Riassunto Programmazione.docx
+++ b/Programmazione/Riassunto Programmazione.docx
@@ -10004,6 +10004,2254 @@
       </w:r>
       <w:r>
         <w:t>. Passare l'indirizzo anziché il semplice valore consente a scanf() di individuare esattamente la cella di memoria da sovrascrivere con l'input fornito dall'utente.</w:t>
+      </w:r>
+    </w:p>
+    <w:p>
+      <w:pPr>
+        <w:pStyle w:val="Titolo1"/>
+      </w:pPr>
+      <w:r>
+        <w:rPr>
+          <w:b/>
+          <w:color w:val="EE0000"/>
+        </w:rPr>
+        <w:t>Capitolo 9: Il Referenziamento e l'Indirizzo delle Variabili</w:t>
+      </w:r>
+    </w:p>
+    <w:p>
+      <w:pPr>
+        <w:pStyle w:val="Titolo2"/>
+      </w:pPr>
+      <w:r>
+        <w:rPr>
+          <w:b/>
+          <w:color w:val="E97132"/>
+        </w:rPr>
+        <w:t>L'indirizzo di una variabile</w:t>
+      </w:r>
+    </w:p>
+    <w:p>
+      <w:r>
+        <w:rPr/>
+        <w:t xml:space="preserve">Nel modello di Von Neumann ogni variabile è memorizzata nella memoria centrale e occupa una certa quantità di byte. Per identificarla, la CPU usa il suo </w:t>
+      </w:r>
+      <w:r>
+        <w:rPr>
+          <w:b/>
+        </w:rPr>
+        <w:t>indirizzo di memoria</w:t>
+      </w:r>
+      <w:r>
+        <w:rPr/>
+        <w:t>: un numero senza segno e univoco, analogo al numero civico di una casa. Per compattezza un indirizzo si visualizza di solito in formato esadecimale (ad esempio 0x7fffd0624e0c).</w:t>
+      </w:r>
+    </w:p>
+    <w:p>
+      <w:r>
+        <w:rPr/>
+        <w:t>Il linguaggio C permette di ottenere questo indirizzo tramite l'</w:t>
+      </w:r>
+      <w:r>
+        <w:rPr>
+          <w:b/>
+        </w:rPr>
+        <w:t>operatore di referenziamento</w:t>
+      </w:r>
+      <w:r>
+        <w:rPr/>
+        <w:t xml:space="preserve"> &amp; (</w:t>
+      </w:r>
+      <w:r>
+        <w:rPr>
+          <w:i/>
+        </w:rPr>
+        <w:t>ampersand</w:t>
+      </w:r>
+      <w:r>
+        <w:rPr/>
+        <w:t>). L'espressione &amp;x si legge "l'indirizzo della variabile x". L'operatore era già comparso nel capitolo 8, nella lettura con scanf: qui lo studiamo in dettaglio.</w:t>
+      </w:r>
+    </w:p>
+    <w:p>
+      <w:pPr>
+        <w:pStyle w:val="Titolo2"/>
+      </w:pPr>
+      <w:r>
+        <w:rPr>
+          <w:b/>
+          <w:color w:val="E97132"/>
+        </w:rPr>
+        <w:t>Valore e indirizzo sono informazioni diverse</w:t>
+      </w:r>
+    </w:p>
+    <w:p>
+      <w:r>
+        <w:rPr/>
+        <w:t>Ogni variabile ha due caratteristiche distinte: un valore e un indirizzo. Dato il codice:</w:t>
+      </w:r>
+    </w:p>
+    <w:p>
+      <w:pPr>
+        <w:spacing w:after="0" w:before="0" w:line="240" w:lineRule="auto"/>
+      </w:pPr>
+      <w:r>
+        <w:rPr>
+          <w:rFonts w:ascii="Consolas" w:hAnsi="Consolas" w:cs="Consolas"/>
+          <w:sz w:val="17"/>
+        </w:rPr>
+        <w:t>int main(void) {</w:t>
+      </w:r>
+    </w:p>
+    <w:p>
+      <w:pPr>
+        <w:spacing w:after="0" w:before="0" w:line="240" w:lineRule="auto"/>
+      </w:pPr>
+      <w:r>
+        <w:rPr>
+          <w:rFonts w:ascii="Consolas" w:hAnsi="Consolas" w:cs="Consolas"/>
+          <w:sz w:val="17"/>
+        </w:rPr>
+        <w:t xml:space="preserve">    int x = 5;</w:t>
+      </w:r>
+    </w:p>
+    <w:p>
+      <w:pPr>
+        <w:spacing w:after="0" w:before="0" w:line="240" w:lineRule="auto"/>
+      </w:pPr>
+      <w:r>
+        <w:rPr>
+          <w:rFonts w:ascii="Consolas" w:hAnsi="Consolas" w:cs="Consolas"/>
+          <w:sz w:val="17"/>
+        </w:rPr>
+        <w:t>}</w:t>
+      </w:r>
+    </w:p>
+    <w:p/>
+    <w:p>
+      <w:r>
+        <w:rPr/>
+        <w:t xml:space="preserve">Qui x è il </w:t>
+      </w:r>
+      <w:r>
+        <w:rPr>
+          <w:b/>
+        </w:rPr>
+        <w:t>valore</w:t>
+      </w:r>
+      <w:r>
+        <w:rPr/>
+        <w:t>, cioè il contenuto della cella di memoria (5), mentre &amp;x è l'</w:t>
+      </w:r>
+      <w:r>
+        <w:rPr>
+          <w:b/>
+        </w:rPr>
+        <w:t>indirizzo</w:t>
+      </w:r>
+      <w:r>
+        <w:rPr/>
+        <w:t>, cioè la posizione della cella in memoria (nello schema del corso, 0x03FC). Le due espressioni non vanno confuse: indicano cose diverse.</w:t>
+      </w:r>
+    </w:p>
+    <w:p>
+      <w:pPr>
+        <w:pStyle w:val="Titolo2"/>
+      </w:pPr>
+      <w:r>
+        <w:rPr>
+          <w:b/>
+          <w:color w:val="E97132"/>
+        </w:rPr>
+        <w:t>Perché è utile conoscere gli indirizzi</w:t>
+      </w:r>
+    </w:p>
+    <w:p>
+      <w:r>
+        <w:rPr/>
+        <w:t>Poter nominare l'indirizzo di una variabile permette di scrivere istruzioni del tipo "moltiplica due numeri e memorizza il risultato in questa cella di memoria" oppure "leggi da tastiera un numero e memorizzalo nello spazio di memoria di una certa variabile". Ma c'è di più:</w:t>
+      </w:r>
+    </w:p>
+    <w:p>
+      <w:pPr>
+        <w:numPr>
+          <w:ilvl w:val="0"/>
+          <w:numId w:val="1"/>
+        </w:numPr>
+      </w:pPr>
+      <w:r>
+        <w:rPr/>
+        <w:t xml:space="preserve">è indispensabile per lavorare con i </w:t>
+      </w:r>
+      <w:r>
+        <w:rPr>
+          <w:b/>
+        </w:rPr>
+        <w:t>puntatori</w:t>
+      </w:r>
+      <w:r>
+        <w:rPr/>
+        <w:t>, cioè variabili il cui valore è un indirizzo di memoria;</w:t>
+      </w:r>
+    </w:p>
+    <w:p>
+      <w:pPr>
+        <w:numPr>
+          <w:ilvl w:val="0"/>
+          <w:numId w:val="1"/>
+        </w:numPr>
+      </w:pPr>
+      <w:r>
+        <w:rPr/>
+        <w:t>rende possibile gestire la memoria dinamica, le strutture dati complesse e la comunicazione efficiente tra funzioni.</w:t>
+      </w:r>
+    </w:p>
+    <w:p>
+      <w:r>
+        <w:rPr/>
+        <w:t>Per cominciare ci limitiamo a un uso semplice: stampare gli indirizzi a video. (Come nelle slide, negli esempi si omette la riga #include &lt;stdio.h&gt;, necessaria per usare printf e scanf.)</w:t>
+      </w:r>
+    </w:p>
+    <w:p>
+      <w:pPr>
+        <w:pStyle w:val="Titolo2"/>
+      </w:pPr>
+      <w:r>
+        <w:rPr>
+          <w:b/>
+          <w:color w:val="E97132"/>
+        </w:rPr>
+        <w:t>Stampare un indirizzo con %p</w:t>
+      </w:r>
+    </w:p>
+    <w:p>
+      <w:r>
+        <w:rPr/>
+        <w:t xml:space="preserve">La funzione printf usa lo specificatore di conversione </w:t>
+      </w:r>
+      <w:r>
+        <w:rPr>
+          <w:b/>
+        </w:rPr>
+        <w:t>%p</w:t>
+      </w:r>
+      <w:r>
+        <w:rPr/>
+        <w:t xml:space="preserve"> per mostrare un indirizzo, normalmente in forma esadecimale:</w:t>
+      </w:r>
+    </w:p>
+    <w:p>
+      <w:pPr>
+        <w:spacing w:after="0" w:before="0" w:line="240" w:lineRule="auto"/>
+      </w:pPr>
+      <w:r>
+        <w:rPr>
+          <w:rFonts w:ascii="Consolas" w:hAnsi="Consolas" w:cs="Consolas"/>
+          <w:sz w:val="17"/>
+        </w:rPr>
+        <w:t>int main(void) {</w:t>
+      </w:r>
+    </w:p>
+    <w:p>
+      <w:pPr>
+        <w:spacing w:after="0" w:before="0" w:line="240" w:lineRule="auto"/>
+      </w:pPr>
+      <w:r>
+        <w:rPr>
+          <w:rFonts w:ascii="Consolas" w:hAnsi="Consolas" w:cs="Consolas"/>
+          <w:sz w:val="17"/>
+        </w:rPr>
+        <w:t xml:space="preserve">    int x = 5;</w:t>
+      </w:r>
+    </w:p>
+    <w:p>
+      <w:pPr>
+        <w:spacing w:after="0" w:before="0" w:line="240" w:lineRule="auto"/>
+      </w:pPr>
+      <w:r>
+        <w:rPr>
+          <w:rFonts w:ascii="Consolas" w:hAnsi="Consolas" w:cs="Consolas"/>
+          <w:sz w:val="17"/>
+        </w:rPr>
+        <w:t xml:space="preserve">    int y = 2;</w:t>
+      </w:r>
+    </w:p>
+    <w:p>
+      <w:pPr>
+        <w:spacing w:after="0" w:before="0" w:line="240" w:lineRule="auto"/>
+      </w:pPr>
+      <w:r>
+        <w:rPr>
+          <w:rFonts w:ascii="Consolas" w:hAnsi="Consolas" w:cs="Consolas"/>
+          <w:sz w:val="17"/>
+        </w:rPr>
+        <w:t xml:space="preserve">    int z = x + y;</w:t>
+      </w:r>
+    </w:p>
+    <w:p>
+      <w:pPr>
+        <w:spacing w:after="0" w:before="0" w:line="240" w:lineRule="auto"/>
+      </w:pPr>
+      <w:r>
+        <w:rPr>
+          <w:rFonts w:ascii="Consolas" w:hAnsi="Consolas" w:cs="Consolas"/>
+          <w:sz w:val="17"/>
+        </w:rPr>
+      </w:r>
+    </w:p>
+    <w:p>
+      <w:pPr>
+        <w:spacing w:after="0" w:before="0" w:line="240" w:lineRule="auto"/>
+      </w:pPr>
+      <w:r>
+        <w:rPr>
+          <w:rFonts w:ascii="Consolas" w:hAnsi="Consolas" w:cs="Consolas"/>
+          <w:sz w:val="17"/>
+        </w:rPr>
+        <w:t xml:space="preserve">    printf("La var x all'indirizzo %p vale %d \n", &amp;x, x);</w:t>
+      </w:r>
+    </w:p>
+    <w:p>
+      <w:pPr>
+        <w:spacing w:after="0" w:before="0" w:line="240" w:lineRule="auto"/>
+      </w:pPr>
+      <w:r>
+        <w:rPr>
+          <w:rFonts w:ascii="Consolas" w:hAnsi="Consolas" w:cs="Consolas"/>
+          <w:sz w:val="17"/>
+        </w:rPr>
+        <w:t xml:space="preserve">    printf("La var y all'indirizzo %p vale %d \n", &amp;y, y);</w:t>
+      </w:r>
+    </w:p>
+    <w:p>
+      <w:pPr>
+        <w:spacing w:after="0" w:before="0" w:line="240" w:lineRule="auto"/>
+      </w:pPr>
+      <w:r>
+        <w:rPr>
+          <w:rFonts w:ascii="Consolas" w:hAnsi="Consolas" w:cs="Consolas"/>
+          <w:sz w:val="17"/>
+        </w:rPr>
+        <w:t xml:space="preserve">    printf("La var z all'indirizzo %p vale %d \n", &amp;z, z);</w:t>
+      </w:r>
+    </w:p>
+    <w:p>
+      <w:pPr>
+        <w:spacing w:after="0" w:before="0" w:line="240" w:lineRule="auto"/>
+      </w:pPr>
+      <w:r>
+        <w:rPr>
+          <w:rFonts w:ascii="Consolas" w:hAnsi="Consolas" w:cs="Consolas"/>
+          <w:sz w:val="17"/>
+        </w:rPr>
+        <w:t>}</w:t>
+      </w:r>
+    </w:p>
+    <w:p/>
+    <w:p>
+      <w:r>
+        <w:rPr/>
+        <w:t>Un'esecuzione possibile produce:</w:t>
+      </w:r>
+    </w:p>
+    <w:p>
+      <w:pPr>
+        <w:spacing w:after="0" w:before="0" w:line="240" w:lineRule="auto"/>
+      </w:pPr>
+      <w:r>
+        <w:rPr>
+          <w:rFonts w:ascii="Consolas" w:hAnsi="Consolas" w:cs="Consolas"/>
+          <w:sz w:val="17"/>
+        </w:rPr>
+        <w:t>La var x all'indirizzo 0x7fffd0624e0c vale 5</w:t>
+      </w:r>
+    </w:p>
+    <w:p>
+      <w:pPr>
+        <w:spacing w:after="0" w:before="0" w:line="240" w:lineRule="auto"/>
+      </w:pPr>
+      <w:r>
+        <w:rPr>
+          <w:rFonts w:ascii="Consolas" w:hAnsi="Consolas" w:cs="Consolas"/>
+          <w:sz w:val="17"/>
+        </w:rPr>
+        <w:t>La var y all'indirizzo 0x7fffd0624e08 vale 2</w:t>
+      </w:r>
+    </w:p>
+    <w:p>
+      <w:pPr>
+        <w:spacing w:after="0" w:before="0" w:line="240" w:lineRule="auto"/>
+      </w:pPr>
+      <w:r>
+        <w:rPr>
+          <w:rFonts w:ascii="Consolas" w:hAnsi="Consolas" w:cs="Consolas"/>
+          <w:sz w:val="17"/>
+        </w:rPr>
+        <w:t>La var z all'indirizzo 0x7fffd0624e04 vale 7</w:t>
+      </w:r>
+    </w:p>
+    <w:p/>
+    <w:p>
+      <w:r>
+        <w:rPr/>
+        <w:t>Si nota che le variabili dichiarate dopo hanno indirizzi più bassi, e che i tre interi da 4 byte occupano celle contigue: è coerente con il modello dello stack usato nel corso, che si sviluppa verso indirizzi decrescenti (capitolo 7).</w:t>
+      </w:r>
+    </w:p>
+    <w:p>
+      <w:pPr>
+        <w:pStyle w:val="Titolo2"/>
+      </w:pPr>
+      <w:r>
+        <w:rPr>
+          <w:b/>
+          <w:color w:val="E97132"/>
+        </w:rPr>
+        <w:t>Il formato concreto degli indirizzi</w:t>
+      </w:r>
+    </w:p>
+    <w:p>
+      <w:r>
+        <w:rPr/>
+        <w:t xml:space="preserve">Il valore concreto di un indirizzo dipende dalla piattaforma e dalla singola esecuzione del programma; di solito è un numero molto grande (i dettagli si vedono nel corso di Sistemi Operativi). Per questo il valore stampato </w:t>
+      </w:r>
+      <w:r>
+        <w:rPr>
+          <w:b/>
+        </w:rPr>
+        <w:t>non deve mai essere incorporato nella logica del programma</w:t>
+      </w:r>
+      <w:r>
+        <w:rPr/>
+        <w:t>.</w:t>
+      </w:r>
+    </w:p>
+    <w:p>
+      <w:r>
+        <w:rPr/>
+        <w:t>Negli esempi del corso si usano indirizzi simbolici più corti, come 0x03FC, 0x03F8 e 0x03F4, per rendere leggibili gli schemi della memoria. Ciò che conta non è il valore numerico dell'indirizzo, ma il fatto che identifichi una posizione in memoria.</w:t>
+      </w:r>
+    </w:p>
+    <w:p>
+      <w:pPr>
+        <w:pStyle w:val="Titolo1"/>
+      </w:pPr>
+      <w:r>
+        <w:rPr>
+          <w:b/>
+          <w:color w:val="EE0000"/>
+        </w:rPr>
+        <w:t>Capitolo 10: L'Input da Tastiera con scanf()</w:t>
+      </w:r>
+    </w:p>
+    <w:p>
+      <w:pPr>
+        <w:pStyle w:val="Titolo2"/>
+      </w:pPr>
+      <w:r>
+        <w:rPr>
+          <w:b/>
+          <w:color w:val="E97132"/>
+        </w:rPr>
+        <w:t>Perché scanf ha bisogno dell'indirizzo</w:t>
+      </w:r>
+    </w:p>
+    <w:p>
+      <w:r>
+        <w:rPr/>
+        <w:t xml:space="preserve">Un programma non deve solo mostrare risultati, ma spesso anche ricevere dati dall'utente. In C questo si fa con la funzione </w:t>
+      </w:r>
+      <w:r>
+        <w:rPr>
+          <w:b/>
+        </w:rPr>
+        <w:t>scanf()</w:t>
+      </w:r>
+      <w:r>
+        <w:rPr/>
+        <w:t xml:space="preserve"> (le basi sono nel capitolo 8, qui ne approfondiamo il funzionamento), che legge i valori digitati da tastiera e li memorizza direttamente in variabili. Per leggere un intero in una variabile x già dichiarata si scrive:</w:t>
+      </w:r>
+    </w:p>
+    <w:p>
+      <w:pPr>
+        <w:spacing w:after="0" w:before="0" w:line="240" w:lineRule="auto"/>
+      </w:pPr>
+      <w:r>
+        <w:rPr>
+          <w:rFonts w:ascii="Consolas" w:hAnsi="Consolas" w:cs="Consolas"/>
+          <w:sz w:val="17"/>
+        </w:rPr>
+        <w:t>scanf("%d", &amp;x);</w:t>
+      </w:r>
+    </w:p>
+    <w:p/>
+    <w:p>
+      <w:r>
+        <w:rPr/>
+        <w:t>Passando l'indirizzo &amp;x, si permette a scanf() di sapere in quale cella di memoria scrivere il dato letto. La funzione termina quando l'utente ha inserito l'input e preme INVIO.</w:t>
+      </w:r>
+    </w:p>
+    <w:p>
+      <w:pPr>
+        <w:pStyle w:val="Titolo2"/>
+      </w:pPr>
+      <w:r>
+        <w:rPr>
+          <w:b/>
+          <w:color w:val="E97132"/>
+        </w:rPr>
+        <w:t>Un esempio passo per passo</w:t>
+      </w:r>
+    </w:p>
+    <w:p>
+      <w:r>
+        <w:rPr/>
+        <w:t>Nel programma seguente le tre variabili occupano, nello schema del corso, gli indirizzi 0x03FC (x), 0x03F8 (y) e 0x03F4 (z):</w:t>
+      </w:r>
+    </w:p>
+    <w:p>
+      <w:pPr>
+        <w:spacing w:after="0" w:before="0" w:line="240" w:lineRule="auto"/>
+      </w:pPr>
+      <w:r>
+        <w:rPr>
+          <w:rFonts w:ascii="Consolas" w:hAnsi="Consolas" w:cs="Consolas"/>
+          <w:sz w:val="17"/>
+        </w:rPr>
+        <w:t>int main(void) {</w:t>
+      </w:r>
+    </w:p>
+    <w:p>
+      <w:pPr>
+        <w:spacing w:after="0" w:before="0" w:line="240" w:lineRule="auto"/>
+      </w:pPr>
+      <w:r>
+        <w:rPr>
+          <w:rFonts w:ascii="Consolas" w:hAnsi="Consolas" w:cs="Consolas"/>
+          <w:sz w:val="17"/>
+        </w:rPr>
+        <w:t xml:space="preserve">    int x, y, z;</w:t>
+      </w:r>
+    </w:p>
+    <w:p>
+      <w:pPr>
+        <w:spacing w:after="0" w:before="0" w:line="240" w:lineRule="auto"/>
+      </w:pPr>
+      <w:r>
+        <w:rPr>
+          <w:rFonts w:ascii="Consolas" w:hAnsi="Consolas" w:cs="Consolas"/>
+          <w:sz w:val="17"/>
+        </w:rPr>
+        <w:t xml:space="preserve">    printf("Inserisci x: ");</w:t>
+      </w:r>
+    </w:p>
+    <w:p>
+      <w:pPr>
+        <w:spacing w:after="0" w:before="0" w:line="240" w:lineRule="auto"/>
+      </w:pPr>
+      <w:r>
+        <w:rPr>
+          <w:rFonts w:ascii="Consolas" w:hAnsi="Consolas" w:cs="Consolas"/>
+          <w:sz w:val="17"/>
+        </w:rPr>
+        <w:t xml:space="preserve">    scanf("%d", &amp;x);</w:t>
+      </w:r>
+    </w:p>
+    <w:p>
+      <w:pPr>
+        <w:spacing w:after="0" w:before="0" w:line="240" w:lineRule="auto"/>
+      </w:pPr>
+      <w:r>
+        <w:rPr>
+          <w:rFonts w:ascii="Consolas" w:hAnsi="Consolas" w:cs="Consolas"/>
+          <w:sz w:val="17"/>
+        </w:rPr>
+        <w:t xml:space="preserve">    printf("Inserisci y: ");</w:t>
+      </w:r>
+    </w:p>
+    <w:p>
+      <w:pPr>
+        <w:spacing w:after="0" w:before="0" w:line="240" w:lineRule="auto"/>
+      </w:pPr>
+      <w:r>
+        <w:rPr>
+          <w:rFonts w:ascii="Consolas" w:hAnsi="Consolas" w:cs="Consolas"/>
+          <w:sz w:val="17"/>
+        </w:rPr>
+        <w:t xml:space="preserve">    scanf("%d", &amp;y);</w:t>
+      </w:r>
+    </w:p>
+    <w:p>
+      <w:pPr>
+        <w:spacing w:after="0" w:before="0" w:line="240" w:lineRule="auto"/>
+      </w:pPr>
+      <w:r>
+        <w:rPr>
+          <w:rFonts w:ascii="Consolas" w:hAnsi="Consolas" w:cs="Consolas"/>
+          <w:sz w:val="17"/>
+        </w:rPr>
+        <w:t xml:space="preserve">    z = x + y;</w:t>
+      </w:r>
+    </w:p>
+    <w:p>
+      <w:pPr>
+        <w:spacing w:after="0" w:before="0" w:line="240" w:lineRule="auto"/>
+      </w:pPr>
+      <w:r>
+        <w:rPr>
+          <w:rFonts w:ascii="Consolas" w:hAnsi="Consolas" w:cs="Consolas"/>
+          <w:sz w:val="17"/>
+        </w:rPr>
+        <w:t xml:space="preserve">    printf("%d + %d = %d\n", x, y, z);</w:t>
+      </w:r>
+    </w:p>
+    <w:p>
+      <w:pPr>
+        <w:spacing w:after="0" w:before="0" w:line="240" w:lineRule="auto"/>
+      </w:pPr>
+      <w:r>
+        <w:rPr>
+          <w:rFonts w:ascii="Consolas" w:hAnsi="Consolas" w:cs="Consolas"/>
+          <w:sz w:val="17"/>
+        </w:rPr>
+        <w:t>}</w:t>
+      </w:r>
+    </w:p>
+    <w:p/>
+    <w:p>
+      <w:r>
+        <w:rPr/>
+        <w:t>Ecco come cambia la memoria durante l'esecuzione:</w:t>
+      </w:r>
+    </w:p>
+    <w:p>
+      <w:pPr>
+        <w:numPr>
+          <w:ilvl w:val="0"/>
+          <w:numId w:val="1"/>
+        </w:numPr>
+      </w:pPr>
+      <w:r>
+        <w:rPr/>
+        <w:t>all'inizio x, y e z hanno un valore indeterminato (nello schema, "?");</w:t>
+      </w:r>
+    </w:p>
+    <w:p>
+      <w:pPr>
+        <w:numPr>
+          <w:ilvl w:val="0"/>
+          <w:numId w:val="1"/>
+        </w:numPr>
+      </w:pPr>
+      <w:r>
+        <w:rPr/>
+        <w:t>se l'utente digita 5, la prima scanf scrive 5 nella cella di x;</w:t>
+      </w:r>
+    </w:p>
+    <w:p>
+      <w:pPr>
+        <w:numPr>
+          <w:ilvl w:val="0"/>
+          <w:numId w:val="1"/>
+        </w:numPr>
+      </w:pPr>
+      <w:r>
+        <w:rPr/>
+        <w:t>se poi digita 2, la seconda scanf scrive 2 nella cella di y;</w:t>
+      </w:r>
+    </w:p>
+    <w:p>
+      <w:pPr>
+        <w:numPr>
+          <w:ilvl w:val="0"/>
+          <w:numId w:val="1"/>
+        </w:numPr>
+      </w:pPr>
+      <w:r>
+        <w:rPr/>
+        <w:t>l'assegnamento calcola z = 7 e l'ultima printf stampa "5 + 2 = 7".</w:t>
+      </w:r>
+    </w:p>
+    <w:p>
+      <w:pPr>
+        <w:pStyle w:val="Titolo2"/>
+      </w:pPr>
+      <w:r>
+        <w:rPr>
+          <w:b/>
+          <w:color w:val="E97132"/>
+        </w:rPr>
+        <w:t>Leggere più valori con una sola chiamata</w:t>
+      </w:r>
+    </w:p>
+    <w:p>
+      <w:r>
+        <w:rPr/>
+        <w:t>Con una sola scanf si possono leggere più valori, indicando più specificatori e più indirizzi:</w:t>
+      </w:r>
+    </w:p>
+    <w:p>
+      <w:pPr>
+        <w:spacing w:after="0" w:before="0" w:line="240" w:lineRule="auto"/>
+      </w:pPr>
+      <w:r>
+        <w:rPr>
+          <w:rFonts w:ascii="Consolas" w:hAnsi="Consolas" w:cs="Consolas"/>
+          <w:sz w:val="17"/>
+        </w:rPr>
+        <w:t>scanf("%d%d", &amp;x, &amp;y);</w:t>
+      </w:r>
+    </w:p>
+    <w:p/>
+    <w:p>
+      <w:r>
+        <w:rPr/>
+        <w:t>L'utente può separare i due numeri con uno o più caratteri di spaziatura (ad esempio "5 2").</w:t>
+      </w:r>
+    </w:p>
+    <w:p>
+      <w:pPr>
+        <w:pStyle w:val="Titolo2"/>
+      </w:pPr>
+      <w:r>
+        <w:rPr>
+          <w:b/>
+          <w:color w:val="E97132"/>
+        </w:rPr>
+        <w:t>Il valore di ritorno e i limiti di scanf</w:t>
+      </w:r>
+    </w:p>
+    <w:p>
+      <w:r>
+        <w:rPr/>
+        <w:t xml:space="preserve">La gestione dell'input è un punto critico: l'utente può sempre inserire valori sbagliati o incompleti. La funzione scanf() prova a interpretare l'input in base al formato specificato e, se incontra un dato incompatibile (per esempio un carattere al posto di un numero), </w:t>
+      </w:r>
+      <w:r>
+        <w:rPr>
+          <w:b/>
+        </w:rPr>
+        <w:t>smette di leggere</w:t>
+      </w:r>
+      <w:r>
+        <w:rPr/>
+        <w:t xml:space="preserve"> e restituisce il numero di valori letti con successo, che può essere minore di quelli attesi. Per esempio, dopo</w:t>
+      </w:r>
+    </w:p>
+    <w:p>
+      <w:pPr>
+        <w:spacing w:after="0" w:before="0" w:line="240" w:lineRule="auto"/>
+      </w:pPr>
+      <w:r>
+        <w:rPr>
+          <w:rFonts w:ascii="Consolas" w:hAnsi="Consolas" w:cs="Consolas"/>
+          <w:sz w:val="17"/>
+        </w:rPr>
+        <w:t>int x, y;</w:t>
+      </w:r>
+    </w:p>
+    <w:p>
+      <w:pPr>
+        <w:spacing w:after="0" w:before="0" w:line="240" w:lineRule="auto"/>
+      </w:pPr>
+      <w:r>
+        <w:rPr>
+          <w:rFonts w:ascii="Consolas" w:hAnsi="Consolas" w:cs="Consolas"/>
+          <w:sz w:val="17"/>
+        </w:rPr>
+        <w:t>int n = scanf("%d%d", &amp;x, &amp;y);</w:t>
+      </w:r>
+    </w:p>
+    <w:p/>
+    <w:p>
+      <w:pPr>
+        <w:numPr>
+          <w:ilvl w:val="0"/>
+          <w:numId w:val="1"/>
+        </w:numPr>
+      </w:pPr>
+      <w:r>
+        <w:rPr/>
+        <w:t>se n vale 2, entrambi i valori sono stati letti correttamente;</w:t>
+      </w:r>
+    </w:p>
+    <w:p>
+      <w:pPr>
+        <w:numPr>
+          <w:ilvl w:val="0"/>
+          <w:numId w:val="1"/>
+        </w:numPr>
+      </w:pPr>
+      <w:r>
+        <w:rPr/>
+        <w:t>se n vale 1, solo il primo valore era valido;</w:t>
+      </w:r>
+    </w:p>
+    <w:p>
+      <w:pPr>
+        <w:numPr>
+          <w:ilvl w:val="0"/>
+          <w:numId w:val="1"/>
+        </w:numPr>
+      </w:pPr>
+      <w:r>
+        <w:rPr/>
+        <w:t>se n vale 0, nessun valore è stato letto e le variabili non sono state aggiornate.</w:t>
+      </w:r>
+    </w:p>
+    <w:p>
+      <w:r>
+        <w:rPr/>
+        <w:t>Vediamo il comportamento con un programma che legge un solo intero e stampa quanti valori ha letto:</w:t>
+      </w:r>
+    </w:p>
+    <w:p>
+      <w:pPr>
+        <w:spacing w:after="0" w:before="0" w:line="240" w:lineRule="auto"/>
+      </w:pPr>
+      <w:r>
+        <w:rPr>
+          <w:rFonts w:ascii="Consolas" w:hAnsi="Consolas" w:cs="Consolas"/>
+          <w:sz w:val="17"/>
+        </w:rPr>
+        <w:t>int main(void) {</w:t>
+      </w:r>
+    </w:p>
+    <w:p>
+      <w:pPr>
+        <w:spacing w:after="0" w:before="0" w:line="240" w:lineRule="auto"/>
+      </w:pPr>
+      <w:r>
+        <w:rPr>
+          <w:rFonts w:ascii="Consolas" w:hAnsi="Consolas" w:cs="Consolas"/>
+          <w:sz w:val="17"/>
+        </w:rPr>
+        <w:t xml:space="preserve">    int x;</w:t>
+      </w:r>
+    </w:p>
+    <w:p>
+      <w:pPr>
+        <w:spacing w:after="0" w:before="0" w:line="240" w:lineRule="auto"/>
+      </w:pPr>
+      <w:r>
+        <w:rPr>
+          <w:rFonts w:ascii="Consolas" w:hAnsi="Consolas" w:cs="Consolas"/>
+          <w:sz w:val="17"/>
+        </w:rPr>
+        <w:t xml:space="preserve">    printf("Inserisci un intero: ");</w:t>
+      </w:r>
+    </w:p>
+    <w:p>
+      <w:pPr>
+        <w:spacing w:after="0" w:before="0" w:line="240" w:lineRule="auto"/>
+      </w:pPr>
+      <w:r>
+        <w:rPr>
+          <w:rFonts w:ascii="Consolas" w:hAnsi="Consolas" w:cs="Consolas"/>
+          <w:sz w:val="17"/>
+        </w:rPr>
+        <w:t xml:space="preserve">    int n = scanf("%d", &amp;x);</w:t>
+      </w:r>
+    </w:p>
+    <w:p>
+      <w:pPr>
+        <w:spacing w:after="0" w:before="0" w:line="240" w:lineRule="auto"/>
+      </w:pPr>
+      <w:r>
+        <w:rPr>
+          <w:rFonts w:ascii="Consolas" w:hAnsi="Consolas" w:cs="Consolas"/>
+          <w:sz w:val="17"/>
+        </w:rPr>
+        <w:t xml:space="preserve">    printf("Valori letti correttamente: %d\n", n);</w:t>
+      </w:r>
+    </w:p>
+    <w:p>
+      <w:pPr>
+        <w:spacing w:after="0" w:before="0" w:line="240" w:lineRule="auto"/>
+      </w:pPr>
+      <w:r>
+        <w:rPr>
+          <w:rFonts w:ascii="Consolas" w:hAnsi="Consolas" w:cs="Consolas"/>
+          <w:sz w:val="17"/>
+        </w:rPr>
+        <w:t xml:space="preserve">    printf("x vale %d \n", x);</w:t>
+      </w:r>
+    </w:p>
+    <w:p>
+      <w:pPr>
+        <w:spacing w:after="0" w:before="0" w:line="240" w:lineRule="auto"/>
+      </w:pPr>
+      <w:r>
+        <w:rPr>
+          <w:rFonts w:ascii="Consolas" w:hAnsi="Consolas" w:cs="Consolas"/>
+          <w:sz w:val="17"/>
+        </w:rPr>
+        <w:t>}</w:t>
+      </w:r>
+    </w:p>
+    <w:p/>
+    <w:p>
+      <w:pPr>
+        <w:numPr>
+          <w:ilvl w:val="0"/>
+          <w:numId w:val="1"/>
+        </w:numPr>
+      </w:pPr>
+      <w:r>
+        <w:rPr/>
+        <w:t>con input 1234, scanf legge 1234 e restituisce 1;</w:t>
+      </w:r>
+    </w:p>
+    <w:p>
+      <w:pPr>
+        <w:numPr>
+          <w:ilvl w:val="0"/>
+          <w:numId w:val="1"/>
+        </w:numPr>
+      </w:pPr>
+      <w:r>
+        <w:rPr/>
+        <w:t>con input 1234.56, il formato %d si aspetta un intero: viene letto "1234" e ".56" rimane non consumato nell'input; n vale 1 e x vale 1234;</w:t>
+      </w:r>
+    </w:p>
+    <w:p>
+      <w:pPr>
+        <w:numPr>
+          <w:ilvl w:val="0"/>
+          <w:numId w:val="1"/>
+        </w:numPr>
+      </w:pPr>
+      <w:r>
+        <w:rPr/>
+        <w:t xml:space="preserve">con input A, la lettera non si può interpretare come numero decimale: n vale 0 e </w:t>
+      </w:r>
+      <w:r>
+        <w:rPr>
+          <w:b/>
+        </w:rPr>
+        <w:t>x non viene aggiornata</w:t>
+      </w:r>
+      <w:r>
+        <w:rPr/>
+        <w:t>. Poiché x non era stata inizializzata, la printf tenta di leggere un valore indeterminato e il comportamento del programma è indefinito.</w:t>
+      </w:r>
+    </w:p>
+    <w:p>
+      <w:pPr>
+        <w:pStyle w:val="Titolo2"/>
+      </w:pPr>
+      <w:r>
+        <w:rPr>
+          <w:b/>
+          <w:color w:val="E97132"/>
+        </w:rPr>
+        <w:t>Dichiarare, avere un valore, avere un indirizzo, essere inizializzata</w:t>
+      </w:r>
+    </w:p>
+    <w:p>
+      <w:r>
+        <w:rPr/>
+        <w:t xml:space="preserve">L'ultimo esempio mette in luce quattro nozioni da tenere distinte: la </w:t>
+      </w:r>
+      <w:r>
+        <w:rPr>
+          <w:b/>
+        </w:rPr>
+        <w:t>dichiarazione</w:t>
+      </w:r>
+      <w:r>
+        <w:rPr/>
+        <w:t xml:space="preserve"> di una variabile, il suo </w:t>
+      </w:r>
+      <w:r>
+        <w:rPr>
+          <w:b/>
+        </w:rPr>
+        <w:t>valore</w:t>
+      </w:r>
+      <w:r>
+        <w:rPr/>
+        <w:t xml:space="preserve">, il suo </w:t>
+      </w:r>
+      <w:r>
+        <w:rPr>
+          <w:b/>
+        </w:rPr>
+        <w:t>indirizzo</w:t>
+      </w:r>
+      <w:r>
+        <w:rPr/>
+        <w:t xml:space="preserve"> e il fatto che il valore sia stato </w:t>
+      </w:r>
+      <w:r>
+        <w:rPr>
+          <w:b/>
+        </w:rPr>
+        <w:t>inizializzato</w:t>
+      </w:r>
+      <w:r>
+        <w:rPr/>
+        <w:t>. In particolare è lecito ottenere &amp;x anche se x non è ancora inizializzata: stiamo usando l'indirizzo di x e non leggendo il suo valore. Ma se x non viene inizializzata (in questo caso da scanf), non si può assumere nulla sul suo valore.</w:t>
+      </w:r>
+    </w:p>
+    <w:p>
+      <w:r>
+        <w:rPr/>
+        <w:t>Se invece x era stata inizializzata, per esempio con int x = -1, e l'input non è interpretabile secondo la specifica di conversione, la variabile non viene modificata e conserva il suo valore (nell'esempio, resta -1). Se scanf non aggiorna una variabile non inizializzata, il suo valore resta indeterminato.</w:t>
+      </w:r>
+    </w:p>
+    <w:p>
+      <w:r>
+        <w:rPr>
+          <w:b/>
+        </w:rPr>
+        <w:t>Buona pratica</w:t>
+      </w:r>
+      <w:r>
+        <w:rPr/>
+        <w:t>: conviene sempre controllare il valore restituito da scanf prima di usare le variabili lette. Per capire fino in fondo perché scanf richiede un indirizzo servono i puntatori, che vediamo nel prossimo capitolo.</w:t>
+      </w:r>
+    </w:p>
+    <w:p>
+      <w:pPr>
+        <w:pStyle w:val="Titolo1"/>
+      </w:pPr>
+      <w:r>
+        <w:rPr>
+          <w:b/>
+          <w:color w:val="EE0000"/>
+        </w:rPr>
+        <w:t>Capitolo 11: I Puntatori</w:t>
+      </w:r>
+    </w:p>
+    <w:p>
+      <w:pPr>
+        <w:pStyle w:val="Titolo2"/>
+      </w:pPr>
+      <w:r>
+        <w:rPr>
+          <w:b/>
+          <w:color w:val="E97132"/>
+        </w:rPr>
+        <w:t>Il puntatore come tipo di dati</w:t>
+      </w:r>
+    </w:p>
+    <w:p>
+      <w:r>
+        <w:rPr/>
+        <w:t xml:space="preserve">Un </w:t>
+      </w:r>
+      <w:r>
+        <w:rPr>
+          <w:b/>
+        </w:rPr>
+        <w:t>puntatore</w:t>
+      </w:r>
+      <w:r>
+        <w:rPr/>
+        <w:t xml:space="preserve"> è una variabile che memorizza l'indirizzo di memoria di un'altra variabile, detta </w:t>
+      </w:r>
+      <w:r>
+        <w:rPr>
+          <w:i/>
+        </w:rPr>
+        <w:t>variabile puntata</w:t>
+      </w:r>
+      <w:r>
+        <w:rPr/>
+        <w:t>. Il valore contenuto in un puntatore è quindi un indirizzo, anziché direttamente il dato puntato. Se per esempio la variabile int x = 5 ha indirizzo &amp;x pari a 0x03FC, ci serve un posto dove memorizzare 0x03FC: quel posto è una variabile puntatore.</w:t>
+      </w:r>
+    </w:p>
+    <w:p>
+      <w:r>
+        <w:rPr/>
+        <w:t xml:space="preserve">In C, per ciascun tipo di dati T esiste il corrispondente </w:t>
+      </w:r>
+      <w:r>
+        <w:rPr>
+          <w:b/>
+        </w:rPr>
+        <w:t>tipo puntatore</w:t>
+      </w:r>
+      <w:r>
+        <w:rPr/>
+        <w:t xml:space="preserve"> T* ("T star"): le variabili di tipo T* servono a memorizzare gli indirizzi delle variabili di tipo T. Per esempio:</w:t>
+      </w:r>
+    </w:p>
+    <w:p>
+      <w:pPr>
+        <w:numPr>
+          <w:ilvl w:val="0"/>
+          <w:numId w:val="1"/>
+        </w:numPr>
+      </w:pPr>
+      <w:r>
+        <w:rPr/>
+        <w:t>int è il tipo delle variabili intere;</w:t>
+      </w:r>
+    </w:p>
+    <w:p>
+      <w:pPr>
+        <w:numPr>
+          <w:ilvl w:val="0"/>
+          <w:numId w:val="1"/>
+        </w:numPr>
+      </w:pPr>
+      <w:r>
+        <w:rPr/>
+        <w:t>int* è il tipo delle variabili puntatore che possono contenere indirizzi di variabili int;</w:t>
+      </w:r>
+    </w:p>
+    <w:p>
+      <w:pPr>
+        <w:numPr>
+          <w:ilvl w:val="0"/>
+          <w:numId w:val="1"/>
+        </w:numPr>
+      </w:pPr>
+      <w:r>
+        <w:rPr/>
+        <w:t>float* è il tipo dei puntatori a float.</w:t>
+      </w:r>
+    </w:p>
+    <w:p>
+      <w:pPr>
+        <w:spacing w:after="0" w:before="0" w:line="240" w:lineRule="auto"/>
+      </w:pPr>
+      <w:r>
+        <w:rPr>
+          <w:rFonts w:ascii="Consolas" w:hAnsi="Consolas" w:cs="Consolas"/>
+          <w:sz w:val="17"/>
+        </w:rPr>
+        <w:t>int x = 5;</w:t>
+      </w:r>
+    </w:p>
+    <w:p>
+      <w:pPr>
+        <w:spacing w:after="0" w:before="0" w:line="240" w:lineRule="auto"/>
+      </w:pPr>
+      <w:r>
+        <w:rPr>
+          <w:rFonts w:ascii="Consolas" w:hAnsi="Consolas" w:cs="Consolas"/>
+          <w:sz w:val="17"/>
+        </w:rPr>
+        <w:t>int* pX;</w:t>
+      </w:r>
+    </w:p>
+    <w:p/>
+    <w:p>
+      <w:r>
+        <w:rPr/>
+        <w:t xml:space="preserve">Qui x è una variabile di tipo int e pX è una variabile "puntatore agli interi", di tipo int*. Per convenzione si usa spesso il prefisso p nei nomi dei puntatori. Attenzione: dopo la sola dichiarazione, pX </w:t>
+      </w:r>
+      <w:r>
+        <w:rPr>
+          <w:b/>
+        </w:rPr>
+        <w:t>non contiene ancora un indirizzo valido</w:t>
+      </w:r>
+      <w:r>
+        <w:rPr/>
+        <w:t xml:space="preserve"> da usare.</w:t>
+      </w:r>
+    </w:p>
+    <w:p>
+      <w:pPr>
+        <w:pStyle w:val="Titolo2"/>
+      </w:pPr>
+      <w:r>
+        <w:rPr>
+          <w:b/>
+          <w:color w:val="E97132"/>
+        </w:rPr>
+        <w:t>L'operatore di referenziamento e l'assegnamento a un puntatore</w:t>
+      </w:r>
+    </w:p>
+    <w:p>
+      <w:r>
+        <w:rPr/>
+        <w:t>L'operatore &amp; (</w:t>
+      </w:r>
+      <w:r>
+        <w:rPr>
+          <w:i/>
+        </w:rPr>
+        <w:t>address-of</w:t>
+      </w:r>
+      <w:r>
+        <w:rPr/>
+        <w:t>), applicato a una variabile, ne restituisce l'indirizzo con tipo "puntatore al tipo della variabile". Possiamo allora inizializzare il puntatore:</w:t>
+      </w:r>
+    </w:p>
+    <w:p>
+      <w:pPr>
+        <w:spacing w:after="0" w:before="0" w:line="240" w:lineRule="auto"/>
+      </w:pPr>
+      <w:r>
+        <w:rPr>
+          <w:rFonts w:ascii="Consolas" w:hAnsi="Consolas" w:cs="Consolas"/>
+          <w:sz w:val="17"/>
+        </w:rPr>
+        <w:t>int x = 5;</w:t>
+      </w:r>
+    </w:p>
+    <w:p>
+      <w:pPr>
+        <w:spacing w:after="0" w:before="0" w:line="240" w:lineRule="auto"/>
+      </w:pPr>
+      <w:r>
+        <w:rPr>
+          <w:rFonts w:ascii="Consolas" w:hAnsi="Consolas" w:cs="Consolas"/>
+          <w:sz w:val="17"/>
+        </w:rPr>
+        <w:t>int* pX = &amp;x;   // pX riceve l'indirizzo di x</w:t>
+      </w:r>
+    </w:p>
+    <w:p/>
+    <w:p>
+      <w:r>
+        <w:rPr/>
+        <w:t>Le tre espressioni si interpretano così:</w:t>
+      </w:r>
+    </w:p>
+    <w:p>
+      <w:pPr>
+        <w:numPr>
+          <w:ilvl w:val="0"/>
+          <w:numId w:val="1"/>
+        </w:numPr>
+      </w:pPr>
+      <w:r>
+        <w:rPr/>
+        <w:t>x è una variabile intera, di valore 5;</w:t>
+      </w:r>
+    </w:p>
+    <w:p>
+      <w:pPr>
+        <w:numPr>
+          <w:ilvl w:val="0"/>
+          <w:numId w:val="1"/>
+        </w:numPr>
+      </w:pPr>
+      <w:r>
+        <w:rPr/>
+        <w:t>&amp;x è un'espressione che vale l'indirizzo di x, di tipo int* (se x è int, allora &amp;x è int*);</w:t>
+      </w:r>
+    </w:p>
+    <w:p>
+      <w:pPr>
+        <w:numPr>
+          <w:ilvl w:val="0"/>
+          <w:numId w:val="1"/>
+        </w:numPr>
+      </w:pPr>
+      <w:r>
+        <w:rPr/>
+        <w:t>pX è un puntatore a intero che memorizza l'indirizzo di x.</w:t>
+      </w:r>
+    </w:p>
+    <w:p>
+      <w:r>
+        <w:rPr/>
+        <w:t>L'operatore &amp; va applicato a qualcosa che identifica una posizione di memoria: non si può applicare a un semplice valore né al risultato temporaneo di un calcolo. Sono quindi errori:</w:t>
+      </w:r>
+    </w:p>
+    <w:p>
+      <w:pPr>
+        <w:spacing w:after="0" w:before="0" w:line="240" w:lineRule="auto"/>
+      </w:pPr>
+      <w:r>
+        <w:rPr>
+          <w:rFonts w:ascii="Consolas" w:hAnsi="Consolas" w:cs="Consolas"/>
+          <w:sz w:val="17"/>
+        </w:rPr>
+        <w:t>&amp;5        // ERRORE</w:t>
+      </w:r>
+    </w:p>
+    <w:p>
+      <w:pPr>
+        <w:spacing w:after="0" w:before="0" w:line="240" w:lineRule="auto"/>
+      </w:pPr>
+      <w:r>
+        <w:rPr>
+          <w:rFonts w:ascii="Consolas" w:hAnsi="Consolas" w:cs="Consolas"/>
+          <w:sz w:val="17"/>
+        </w:rPr>
+        <w:t>&amp;(x + 1)  // ERRORE</w:t>
+      </w:r>
+    </w:p>
+    <w:p/>
+    <w:p>
+      <w:pPr>
+        <w:pStyle w:val="Titolo2"/>
+      </w:pPr>
+      <w:r>
+        <w:rPr>
+          <w:b/>
+          <w:color w:val="E97132"/>
+        </w:rPr>
+        <w:t>Un puntatore è una variabile come le altre</w:t>
+      </w:r>
+    </w:p>
+    <w:p>
+      <w:r>
+        <w:rPr/>
+        <w:t>Nello schema della memoria la variabile x contiene il valore 5 all'indirizzo 0x03FC, mentre la variabile pX contiene 0x03FC, cioè l'indirizzo di x, e si trova a sua volta a un indirizzo proprio (nell'esempio 0x03F8). Un puntatore contiene un indirizzo, ma essendo una variabile occupa memoria e ha anche un suo indirizzo. L'assegnamento pX = &amp;x è corretto perché &amp;x e pX hanno lo stesso tipo, int*.</w:t>
+      </w:r>
+    </w:p>
+    <w:p>
+      <w:r>
+        <w:rPr/>
+        <w:t>Per vederlo si possono stampare sia l'indirizzo del puntatore (&amp;pX) sia il suo valore (pX):</w:t>
+      </w:r>
+    </w:p>
+    <w:p>
+      <w:pPr>
+        <w:spacing w:after="0" w:before="0" w:line="240" w:lineRule="auto"/>
+      </w:pPr>
+      <w:r>
+        <w:rPr>
+          <w:rFonts w:ascii="Consolas" w:hAnsi="Consolas" w:cs="Consolas"/>
+          <w:sz w:val="17"/>
+        </w:rPr>
+        <w:t>int main(void) {</w:t>
+      </w:r>
+    </w:p>
+    <w:p>
+      <w:pPr>
+        <w:spacing w:after="0" w:before="0" w:line="240" w:lineRule="auto"/>
+      </w:pPr>
+      <w:r>
+        <w:rPr>
+          <w:rFonts w:ascii="Consolas" w:hAnsi="Consolas" w:cs="Consolas"/>
+          <w:sz w:val="17"/>
+        </w:rPr>
+        <w:t xml:space="preserve">    int x = 5;</w:t>
+      </w:r>
+    </w:p>
+    <w:p>
+      <w:pPr>
+        <w:spacing w:after="0" w:before="0" w:line="240" w:lineRule="auto"/>
+      </w:pPr>
+      <w:r>
+        <w:rPr>
+          <w:rFonts w:ascii="Consolas" w:hAnsi="Consolas" w:cs="Consolas"/>
+          <w:sz w:val="17"/>
+        </w:rPr>
+        <w:t xml:space="preserve">    int* pX;</w:t>
+      </w:r>
+    </w:p>
+    <w:p>
+      <w:pPr>
+        <w:spacing w:after="0" w:before="0" w:line="240" w:lineRule="auto"/>
+      </w:pPr>
+      <w:r>
+        <w:rPr>
+          <w:rFonts w:ascii="Consolas" w:hAnsi="Consolas" w:cs="Consolas"/>
+          <w:sz w:val="17"/>
+        </w:rPr>
+        <w:t xml:space="preserve">    pX = &amp;x;</w:t>
+      </w:r>
+    </w:p>
+    <w:p>
+      <w:pPr>
+        <w:spacing w:after="0" w:before="0" w:line="240" w:lineRule="auto"/>
+      </w:pPr>
+      <w:r>
+        <w:rPr>
+          <w:rFonts w:ascii="Consolas" w:hAnsi="Consolas" w:cs="Consolas"/>
+          <w:sz w:val="17"/>
+        </w:rPr>
+        <w:t xml:space="preserve">    printf("Il ptr pX all'ind %p vale %p \n", &amp;pX, pX);</w:t>
+      </w:r>
+    </w:p>
+    <w:p>
+      <w:pPr>
+        <w:spacing w:after="0" w:before="0" w:line="240" w:lineRule="auto"/>
+      </w:pPr>
+      <w:r>
+        <w:rPr>
+          <w:rFonts w:ascii="Consolas" w:hAnsi="Consolas" w:cs="Consolas"/>
+          <w:sz w:val="17"/>
+        </w:rPr>
+        <w:t>}</w:t>
+      </w:r>
+    </w:p>
+    <w:p/>
+    <w:p>
+      <w:r>
+        <w:rPr/>
+        <w:t>Con gli indirizzi simbolici dello schema, l'output sarebbe "Il ptr pX all'ind 0x03F8 vale 0x03FC".</w:t>
+      </w:r>
+    </w:p>
+    <w:p>
+      <w:pPr>
+        <w:pStyle w:val="Titolo2"/>
+      </w:pPr>
+      <w:r>
+        <w:rPr>
+          <w:b/>
+          <w:color w:val="E97132"/>
+        </w:rPr>
+        <w:t>Due errori tipici</w:t>
+      </w:r>
+    </w:p>
+    <w:p>
+      <w:pPr>
+        <w:numPr>
+          <w:ilvl w:val="0"/>
+          <w:numId w:val="1"/>
+        </w:numPr>
+      </w:pPr>
+      <w:r>
+        <w:rPr>
+          <w:b/>
+        </w:rPr>
+        <w:t>Usare &amp;x prima di aver dichiarato x</w:t>
+      </w:r>
+      <w:r>
+        <w:rPr/>
+        <w:t>: il compilatore segnala un errore ("'x' undeclared"), perché al momento di int* pX = &amp;x la variabile x non esiste ancora.</w:t>
+      </w:r>
+    </w:p>
+    <w:p>
+      <w:pPr>
+        <w:numPr>
+          <w:ilvl w:val="0"/>
+          <w:numId w:val="1"/>
+        </w:numPr>
+      </w:pPr>
+      <w:r>
+        <w:rPr>
+          <w:b/>
+        </w:rPr>
+        <w:t>Tipi incompatibili</w:t>
+      </w:r>
+      <w:r>
+        <w:rPr/>
+        <w:t>: se x è un float, &amp;x ha tipo float* e non è compatibile con una variabile int*; il compilatore avverte con un warning ("initialization of 'int *' from incompatible pointer type 'float *'"). Nei compilatori più recenti (ad esempio GCC 14) questo caso è invece un errore di compilazione.</w:t>
+      </w:r>
+    </w:p>
+    <w:p>
+      <w:pPr>
+        <w:pStyle w:val="Titolo2"/>
+      </w:pPr>
+      <w:r>
+        <w:rPr>
+          <w:b/>
+          <w:color w:val="E97132"/>
+        </w:rPr>
+        <w:t>Come si scrive la dichiarazione</w:t>
+      </w:r>
+    </w:p>
+    <w:p>
+      <w:r>
+        <w:rPr/>
+        <w:t>Finora abbiamo scritto int* pX, ma è in uso frequente anche la convenzione int *pX. Il simbolo * ha anche un altro significato nelle operazioni sui puntatori, il dereferenziamento, che vediamo nel prossimo capitolo.</w:t>
+      </w:r>
+    </w:p>
+    <w:p>
+      <w:pPr>
+        <w:pStyle w:val="Titolo2"/>
+      </w:pPr>
+      <w:r>
+        <w:rPr>
+          <w:b/>
+          <w:color w:val="E97132"/>
+        </w:rPr>
+        <w:t>scanf riletta con i puntatori</w:t>
+      </w:r>
+    </w:p>
+    <w:p>
+      <w:r>
+        <w:rPr/>
+        <w:t xml:space="preserve">La documentazione di scanf richiede che ogni conversione riceva un </w:t>
+      </w:r>
+      <w:r>
+        <w:rPr>
+          <w:b/>
+        </w:rPr>
+        <w:t>puntatore al tipo appropriato</w:t>
+      </w:r>
+      <w:r>
+        <w:rPr/>
+        <w:t>: per %d serve un int*. Con int x, l'espressione &amp;x ha proprio tipo int*, ed è per questo che scanf("%d", &amp;x) funziona: scanf può scrivere in quella cella il valore letto. Ma allora al posto di &amp;x si può passare direttamente un puntatore che contiene lo stesso indirizzo:</w:t>
+      </w:r>
+    </w:p>
+    <w:p>
+      <w:pPr>
+        <w:spacing w:after="0" w:before="0" w:line="240" w:lineRule="auto"/>
+      </w:pPr>
+      <w:r>
+        <w:rPr>
+          <w:rFonts w:ascii="Consolas" w:hAnsi="Consolas" w:cs="Consolas"/>
+          <w:sz w:val="17"/>
+        </w:rPr>
+        <w:t>int main(void) {</w:t>
+      </w:r>
+    </w:p>
+    <w:p>
+      <w:pPr>
+        <w:spacing w:after="0" w:before="0" w:line="240" w:lineRule="auto"/>
+      </w:pPr>
+      <w:r>
+        <w:rPr>
+          <w:rFonts w:ascii="Consolas" w:hAnsi="Consolas" w:cs="Consolas"/>
+          <w:sz w:val="17"/>
+        </w:rPr>
+        <w:t xml:space="preserve">    int x;</w:t>
+      </w:r>
+    </w:p>
+    <w:p>
+      <w:pPr>
+        <w:spacing w:after="0" w:before="0" w:line="240" w:lineRule="auto"/>
+      </w:pPr>
+      <w:r>
+        <w:rPr>
+          <w:rFonts w:ascii="Consolas" w:hAnsi="Consolas" w:cs="Consolas"/>
+          <w:sz w:val="17"/>
+        </w:rPr>
+        <w:t xml:space="preserve">    int* pX = &amp;x;</w:t>
+      </w:r>
+    </w:p>
+    <w:p>
+      <w:pPr>
+        <w:spacing w:after="0" w:before="0" w:line="240" w:lineRule="auto"/>
+      </w:pPr>
+      <w:r>
+        <w:rPr>
+          <w:rFonts w:ascii="Consolas" w:hAnsi="Consolas" w:cs="Consolas"/>
+          <w:sz w:val="17"/>
+        </w:rPr>
+        <w:t xml:space="preserve">    printf("Inserisci un intero: ");</w:t>
+      </w:r>
+    </w:p>
+    <w:p>
+      <w:pPr>
+        <w:spacing w:after="0" w:before="0" w:line="240" w:lineRule="auto"/>
+      </w:pPr>
+      <w:r>
+        <w:rPr>
+          <w:rFonts w:ascii="Consolas" w:hAnsi="Consolas" w:cs="Consolas"/>
+          <w:sz w:val="17"/>
+        </w:rPr>
+        <w:t xml:space="preserve">    scanf("%d", pX);</w:t>
+      </w:r>
+    </w:p>
+    <w:p>
+      <w:pPr>
+        <w:spacing w:after="0" w:before="0" w:line="240" w:lineRule="auto"/>
+      </w:pPr>
+      <w:r>
+        <w:rPr>
+          <w:rFonts w:ascii="Consolas" w:hAnsi="Consolas" w:cs="Consolas"/>
+          <w:sz w:val="17"/>
+        </w:rPr>
+        <w:t xml:space="preserve">    printf("La var x all'ind %p vale %d \n", pX, x);</w:t>
+      </w:r>
+    </w:p>
+    <w:p>
+      <w:pPr>
+        <w:spacing w:after="0" w:before="0" w:line="240" w:lineRule="auto"/>
+      </w:pPr>
+      <w:r>
+        <w:rPr>
+          <w:rFonts w:ascii="Consolas" w:hAnsi="Consolas" w:cs="Consolas"/>
+          <w:sz w:val="17"/>
+        </w:rPr>
+        <w:t>}</w:t>
+      </w:r>
+    </w:p>
+    <w:p/>
+    <w:p>
+      <w:r>
+        <w:rPr/>
+        <w:t>L'assegnamento pX = &amp;x è lecito anche se x non è ancora inizializzata (si usa l'indirizzo, non il valore). Dopo che l'utente ha digitato 5, la cella di x contiene 5, e la printf mostra l'indirizzo contenuto in pX e il valore di x.</w:t>
+      </w:r>
+    </w:p>
+    <w:p>
+      <w:pPr>
+        <w:pStyle w:val="Titolo1"/>
+      </w:pPr>
+      <w:r>
+        <w:rPr>
+          <w:b/>
+          <w:color w:val="EE0000"/>
+        </w:rPr>
+        <w:t>Capitolo 12: Dereferenziamento, Alias e Puntatore Nullo</w:t>
+      </w:r>
+    </w:p>
+    <w:p>
+      <w:pPr>
+        <w:pStyle w:val="Titolo2"/>
+      </w:pPr>
+      <w:r>
+        <w:rPr>
+          <w:b/>
+          <w:color w:val="E97132"/>
+        </w:rPr>
+        <w:t>L'operatore di dereferenziamento *</w:t>
+      </w:r>
+    </w:p>
+    <w:p>
+      <w:r>
+        <w:rPr/>
+        <w:t xml:space="preserve">L'operatore unario </w:t>
+      </w:r>
+      <w:r>
+        <w:rPr>
+          <w:b/>
+        </w:rPr>
+        <w:t>asterisco (*)</w:t>
+      </w:r>
+      <w:r>
+        <w:rPr/>
+        <w:t xml:space="preserve"> (</w:t>
+      </w:r>
+      <w:r>
+        <w:rPr>
+          <w:i/>
+        </w:rPr>
+        <w:t>dereference</w:t>
+      </w:r>
+      <w:r>
+        <w:rPr/>
+        <w:t xml:space="preserve"> o </w:t>
+      </w:r>
+      <w:r>
+        <w:rPr>
+          <w:i/>
+        </w:rPr>
+        <w:t>indirect access</w:t>
+      </w:r>
+      <w:r>
+        <w:rPr/>
+        <w:t>) permette di accedere alla variabile puntata attraverso l'indirizzo memorizzato nel puntatore. Dereferenziare un puntatore significa usare l'indirizzo che contiene per accedere indirettamente alla variabile puntata. Per esempio:</w:t>
+      </w:r>
+    </w:p>
+    <w:p>
+      <w:pPr>
+        <w:spacing w:after="0" w:before="0" w:line="240" w:lineRule="auto"/>
+      </w:pPr>
+      <w:r>
+        <w:rPr>
+          <w:rFonts w:ascii="Consolas" w:hAnsi="Consolas" w:cs="Consolas"/>
+          <w:sz w:val="17"/>
+        </w:rPr>
+        <w:t>int y = 5;</w:t>
+      </w:r>
+    </w:p>
+    <w:p>
+      <w:pPr>
+        <w:spacing w:after="0" w:before="0" w:line="240" w:lineRule="auto"/>
+      </w:pPr>
+      <w:r>
+        <w:rPr>
+          <w:rFonts w:ascii="Consolas" w:hAnsi="Consolas" w:cs="Consolas"/>
+          <w:sz w:val="17"/>
+        </w:rPr>
+        <w:t>int* pY = &amp;y;</w:t>
+      </w:r>
+    </w:p>
+    <w:p>
+      <w:pPr>
+        <w:spacing w:after="0" w:before="0" w:line="240" w:lineRule="auto"/>
+      </w:pPr>
+      <w:r>
+        <w:rPr>
+          <w:rFonts w:ascii="Consolas" w:hAnsi="Consolas" w:cs="Consolas"/>
+          <w:sz w:val="17"/>
+        </w:rPr>
+        <w:t>printf("%d", *pY);</w:t>
+      </w:r>
+    </w:p>
+    <w:p/>
+    <w:p>
+      <w:r>
+        <w:rPr/>
+        <w:t>Qui *pY accede alla stessa cella di memoria di y, perché pY ne contiene l'indirizzo. Il tipo segue una regola semplice: se un puntatore p ha tipo T*, allora l'espressione *p ha tipo T. Negli esempi di questo capitolo si alternano le scritture int* pX e int *pX, equivalenti.</w:t>
+      </w:r>
+    </w:p>
+    <w:p>
+      <w:pPr>
+        <w:pStyle w:val="Titolo2"/>
+      </w:pPr>
+      <w:r>
+        <w:rPr>
+          <w:b/>
+          <w:color w:val="E97132"/>
+        </w:rPr>
+        <w:t>Leggere e modificare tramite il puntatore</w:t>
+      </w:r>
+    </w:p>
+    <w:p>
+      <w:r>
+        <w:rPr/>
+        <w:t>Con int x = 5; e int* pX = &amp;x; si può accedere alla variabile puntata in due modi:</w:t>
+      </w:r>
+    </w:p>
+    <w:p>
+      <w:pPr>
+        <w:numPr>
+          <w:ilvl w:val="0"/>
+          <w:numId w:val="1"/>
+        </w:numPr>
+      </w:pPr>
+      <w:r>
+        <w:rPr>
+          <w:b/>
+        </w:rPr>
+        <w:t>in lettura</w:t>
+      </w:r>
+      <w:r>
+        <w:rPr/>
+        <w:t>: printf("%d\n", *pX) stampa 5, il valore della variabile puntata, come x;</w:t>
+      </w:r>
+    </w:p>
+    <w:p>
+      <w:pPr>
+        <w:numPr>
+          <w:ilvl w:val="0"/>
+          <w:numId w:val="1"/>
+        </w:numPr>
+      </w:pPr>
+      <w:r>
+        <w:rPr>
+          <w:b/>
+        </w:rPr>
+        <w:t>in modifica</w:t>
+      </w:r>
+      <w:r>
+        <w:rPr/>
+        <w:t>: *pX = 10; assegna un nuovo valore alla variabile puntata; dopo l'istruzione x vale 10.</w:t>
+      </w:r>
+    </w:p>
+    <w:p>
+      <w:pPr>
+        <w:spacing w:after="0" w:before="0" w:line="240" w:lineRule="auto"/>
+      </w:pPr>
+      <w:r>
+        <w:rPr>
+          <w:rFonts w:ascii="Consolas" w:hAnsi="Consolas" w:cs="Consolas"/>
+          <w:sz w:val="17"/>
+        </w:rPr>
+        <w:t>int x = 5;</w:t>
+      </w:r>
+    </w:p>
+    <w:p>
+      <w:pPr>
+        <w:spacing w:after="0" w:before="0" w:line="240" w:lineRule="auto"/>
+      </w:pPr>
+      <w:r>
+        <w:rPr>
+          <w:rFonts w:ascii="Consolas" w:hAnsi="Consolas" w:cs="Consolas"/>
+          <w:sz w:val="17"/>
+        </w:rPr>
+        <w:t>int *pX = &amp;x;</w:t>
+      </w:r>
+    </w:p>
+    <w:p>
+      <w:pPr>
+        <w:spacing w:after="0" w:before="0" w:line="240" w:lineRule="auto"/>
+      </w:pPr>
+      <w:r>
+        <w:rPr>
+          <w:rFonts w:ascii="Consolas" w:hAnsi="Consolas" w:cs="Consolas"/>
+          <w:sz w:val="17"/>
+        </w:rPr>
+        <w:t>printf("x = %d\n", x);      // stampa 5</w:t>
+      </w:r>
+    </w:p>
+    <w:p>
+      <w:pPr>
+        <w:spacing w:after="0" w:before="0" w:line="240" w:lineRule="auto"/>
+      </w:pPr>
+      <w:r>
+        <w:rPr>
+          <w:rFonts w:ascii="Consolas" w:hAnsi="Consolas" w:cs="Consolas"/>
+          <w:sz w:val="17"/>
+        </w:rPr>
+        <w:t>printf("*pX = %d\n", *pX);  // stampa ancora 5</w:t>
+      </w:r>
+    </w:p>
+    <w:p>
+      <w:pPr>
+        <w:spacing w:after="0" w:before="0" w:line="240" w:lineRule="auto"/>
+      </w:pPr>
+      <w:r>
+        <w:rPr>
+          <w:rFonts w:ascii="Consolas" w:hAnsi="Consolas" w:cs="Consolas"/>
+          <w:sz w:val="17"/>
+        </w:rPr>
+        <w:t>*pX = 10;                   // modifica x tramite pX</w:t>
+      </w:r>
+    </w:p>
+    <w:p>
+      <w:pPr>
+        <w:spacing w:after="0" w:before="0" w:line="240" w:lineRule="auto"/>
+      </w:pPr>
+      <w:r>
+        <w:rPr>
+          <w:rFonts w:ascii="Consolas" w:hAnsi="Consolas" w:cs="Consolas"/>
+          <w:sz w:val="17"/>
+        </w:rPr>
+        <w:t>printf("x = %d\n", x);      // stampa 10</w:t>
+      </w:r>
+    </w:p>
+    <w:p/>
+    <w:p>
+      <w:r>
+        <w:rPr/>
+        <w:t xml:space="preserve">x e *pX accedono alla </w:t>
+      </w:r>
+      <w:r>
+        <w:rPr>
+          <w:b/>
+        </w:rPr>
+        <w:t>stessa cella</w:t>
+      </w:r>
+      <w:r>
+        <w:rPr/>
+        <w:t>, quindi leggono lo stesso valore: scrivere in *pX modifica x.</w:t>
+      </w:r>
+    </w:p>
+    <w:p>
+      <w:pPr>
+        <w:pStyle w:val="Titolo2"/>
+      </w:pPr>
+      <w:r>
+        <w:rPr>
+          <w:b/>
+          <w:color w:val="E97132"/>
+        </w:rPr>
+        <w:t>Riferimenti multipli e aliasing</w:t>
+      </w:r>
+    </w:p>
+    <w:p>
+      <w:r>
+        <w:rPr/>
+        <w:t>Due puntatori possono contenere lo stesso indirizzo:</w:t>
+      </w:r>
+    </w:p>
+    <w:p>
+      <w:pPr>
+        <w:spacing w:after="0" w:before="0" w:line="240" w:lineRule="auto"/>
+      </w:pPr>
+      <w:r>
+        <w:rPr>
+          <w:rFonts w:ascii="Consolas" w:hAnsi="Consolas" w:cs="Consolas"/>
+          <w:sz w:val="17"/>
+        </w:rPr>
+        <w:t>int x = 5;</w:t>
+      </w:r>
+    </w:p>
+    <w:p>
+      <w:pPr>
+        <w:spacing w:after="0" w:before="0" w:line="240" w:lineRule="auto"/>
+      </w:pPr>
+      <w:r>
+        <w:rPr>
+          <w:rFonts w:ascii="Consolas" w:hAnsi="Consolas" w:cs="Consolas"/>
+          <w:sz w:val="17"/>
+        </w:rPr>
+        <w:t>int* pX = &amp;x;</w:t>
+      </w:r>
+    </w:p>
+    <w:p>
+      <w:pPr>
+        <w:spacing w:after="0" w:before="0" w:line="240" w:lineRule="auto"/>
+      </w:pPr>
+      <w:r>
+        <w:rPr>
+          <w:rFonts w:ascii="Consolas" w:hAnsi="Consolas" w:cs="Consolas"/>
+          <w:sz w:val="17"/>
+        </w:rPr>
+        <w:t>int* pXbis = pX;</w:t>
+      </w:r>
+    </w:p>
+    <w:p>
+      <w:pPr>
+        <w:spacing w:after="0" w:before="0" w:line="240" w:lineRule="auto"/>
+      </w:pPr>
+      <w:r>
+        <w:rPr>
+          <w:rFonts w:ascii="Consolas" w:hAnsi="Consolas" w:cs="Consolas"/>
+          <w:sz w:val="17"/>
+        </w:rPr>
+        <w:t>*pXbis = 1234;</w:t>
+      </w:r>
+    </w:p>
+    <w:p>
+      <w:pPr>
+        <w:spacing w:after="0" w:before="0" w:line="240" w:lineRule="auto"/>
+      </w:pPr>
+      <w:r>
+        <w:rPr>
+          <w:rFonts w:ascii="Consolas" w:hAnsi="Consolas" w:cs="Consolas"/>
+          <w:sz w:val="17"/>
+        </w:rPr>
+        <w:t>printf("x = %d\n", x);          // 1234</w:t>
+      </w:r>
+    </w:p>
+    <w:p>
+      <w:pPr>
+        <w:spacing w:after="0" w:before="0" w:line="240" w:lineRule="auto"/>
+      </w:pPr>
+      <w:r>
+        <w:rPr>
+          <w:rFonts w:ascii="Consolas" w:hAnsi="Consolas" w:cs="Consolas"/>
+          <w:sz w:val="17"/>
+        </w:rPr>
+        <w:t>printf("*pX = %d\n", *pX);      // 1234</w:t>
+      </w:r>
+    </w:p>
+    <w:p>
+      <w:pPr>
+        <w:spacing w:after="0" w:before="0" w:line="240" w:lineRule="auto"/>
+      </w:pPr>
+      <w:r>
+        <w:rPr>
+          <w:rFonts w:ascii="Consolas" w:hAnsi="Consolas" w:cs="Consolas"/>
+          <w:sz w:val="17"/>
+        </w:rPr>
+        <w:t>printf("*pXbis = %d\n", *pXbis);// 1234</w:t>
+      </w:r>
+    </w:p>
+    <w:p/>
+    <w:p>
+      <w:r>
+        <w:rPr/>
+        <w:t>La scrittura su *pXbis avviene nella cella di x: x, *pX e *pXbis indicano la stessa variabile (*pX e *pXbis sono alias di x). pX e pXbis sono due variabili puntatore diverse, ma contengono lo stesso indirizzo. Di conseguenza le tre istruzioni scanf("%d", &amp;x), scanf("%d", pX) e scanf("%d", pXbis) sono equivalenti: indicano sempre la stessa cella.</w:t>
+      </w:r>
+    </w:p>
+    <w:p>
+      <w:r>
+        <w:rPr/>
+        <w:t xml:space="preserve">Questo fenomeno si chiama </w:t>
+      </w:r>
+      <w:r>
+        <w:rPr>
+          <w:b/>
+        </w:rPr>
+        <w:t>aliasing</w:t>
+      </w:r>
+      <w:r>
+        <w:rPr/>
+        <w:t>. Quando si dichiara una variabile in C, essa è accessibile tramite un solo nome simbolico (x). Con i puntatori più "etichette" possono invece fare riferimento allo stesso dato: sia il nome diretto della variabile, sia uno o più puntatori che ne contengono l'indirizzo. Modificando la variabile attraverso uno degli alias, anche gli altri "vedono" il nuovo valore, perché accedono allo stesso indirizzo.</w:t>
+      </w:r>
+    </w:p>
+    <w:p>
+      <w:pPr>
+        <w:pStyle w:val="Titolo2"/>
+      </w:pPr>
+      <w:r>
+        <w:rPr>
+          <w:b/>
+          <w:color w:val="E97132"/>
+        </w:rPr>
+        <w:t>Puntatori non inizializzati e puntatore nullo</w:t>
+      </w:r>
+    </w:p>
+    <w:p>
+      <w:r>
+        <w:rPr/>
+        <w:t xml:space="preserve">Si può dereferenziare un puntatore </w:t>
+      </w:r>
+      <w:r>
+        <w:rPr>
+          <w:b/>
+        </w:rPr>
+        <w:t>solo se contiene un indirizzo valido</w:t>
+      </w:r>
+      <w:r>
+        <w:rPr/>
+        <w:t>. Dopo la sola dichiarazione, un puntatore ha un valore indeterminato, come ogni variabile automatica non inizializzata, e quel valore non può essere usato come indirizzo: dereferenziarlo è un errore a tempo di esecuzione (comportamento indefinito).</w:t>
+      </w:r>
+    </w:p>
+    <w:p>
+      <w:pPr>
+        <w:spacing w:after="0" w:before="0" w:line="240" w:lineRule="auto"/>
+      </w:pPr>
+      <w:r>
+        <w:rPr>
+          <w:rFonts w:ascii="Consolas" w:hAnsi="Consolas" w:cs="Consolas"/>
+          <w:sz w:val="17"/>
+        </w:rPr>
+        <w:t>int* pX;   // non inizializzato</w:t>
+      </w:r>
+    </w:p>
+    <w:p>
+      <w:pPr>
+        <w:spacing w:after="0" w:before="0" w:line="240" w:lineRule="auto"/>
+      </w:pPr>
+      <w:r>
+        <w:rPr>
+          <w:rFonts w:ascii="Consolas" w:hAnsi="Consolas" w:cs="Consolas"/>
+          <w:sz w:val="17"/>
+        </w:rPr>
+        <w:t>*pX = 10;  // ERRORE</w:t>
+      </w:r>
+    </w:p>
+    <w:p/>
+    <w:p>
+      <w:r>
+        <w:rPr/>
+        <w:t xml:space="preserve">Per dare a un puntatore un valore esplicito che significa "non punta a niente" si usa </w:t>
+      </w:r>
+      <w:r>
+        <w:rPr>
+          <w:b/>
+        </w:rPr>
+        <w:t>NULL</w:t>
+      </w:r>
+      <w:r>
+        <w:rPr/>
+        <w:t>, valore di puntatore che indica che quel puntatore non fa riferimento ad alcuna variabile. Si usa come valore di inizializzazione o come valore sentinella:</w:t>
+      </w:r>
+    </w:p>
+    <w:p>
+      <w:pPr>
+        <w:spacing w:after="0" w:before="0" w:line="240" w:lineRule="auto"/>
+      </w:pPr>
+      <w:r>
+        <w:rPr>
+          <w:rFonts w:ascii="Consolas" w:hAnsi="Consolas" w:cs="Consolas"/>
+          <w:sz w:val="17"/>
+        </w:rPr>
+        <w:t>int main(void) {</w:t>
+      </w:r>
+    </w:p>
+    <w:p>
+      <w:pPr>
+        <w:spacing w:after="0" w:before="0" w:line="240" w:lineRule="auto"/>
+      </w:pPr>
+      <w:r>
+        <w:rPr>
+          <w:rFonts w:ascii="Consolas" w:hAnsi="Consolas" w:cs="Consolas"/>
+          <w:sz w:val="17"/>
+        </w:rPr>
+        <w:t xml:space="preserve">    int *p = NULL; // inizializzazione sicura</w:t>
+      </w:r>
+    </w:p>
+    <w:p>
+      <w:pPr>
+        <w:spacing w:after="0" w:before="0" w:line="240" w:lineRule="auto"/>
+      </w:pPr>
+      <w:r>
+        <w:rPr>
+          <w:rFonts w:ascii="Consolas" w:hAnsi="Consolas" w:cs="Consolas"/>
+          <w:sz w:val="17"/>
+        </w:rPr>
+        <w:t xml:space="preserve">    *p = 10;       // ERRORE: p non contiene un indirizzo accessibile</w:t>
+      </w:r>
+    </w:p>
+    <w:p>
+      <w:pPr>
+        <w:spacing w:after="0" w:before="0" w:line="240" w:lineRule="auto"/>
+      </w:pPr>
+      <w:r>
+        <w:rPr>
+          <w:rFonts w:ascii="Consolas" w:hAnsi="Consolas" w:cs="Consolas"/>
+          <w:sz w:val="17"/>
+        </w:rPr>
+        <w:t>}</w:t>
+      </w:r>
+    </w:p>
+    <w:p/>
+    <w:p>
+      <w:r>
+        <w:rPr/>
+        <w:t>NULL consente di inizializzare esplicitamente un puntatore, evitando un valore indeterminato, e di riconoscere esplicitamente il caso "non punta ad alcuna variabile". Attenzione: dereferenziare un puntatore NULL produce un comportamento indefinito (in genere un errore che termina il programma).</w:t>
+      </w:r>
+    </w:p>
+    <w:p>
+      <w:pPr>
+        <w:pStyle w:val="Titolo2"/>
+      </w:pPr>
+      <w:r>
+        <w:rPr>
+          <w:b/>
+          <w:color w:val="E97132"/>
+        </w:rPr>
+        <w:t>La dimensione di un puntatore</w:t>
+      </w:r>
+    </w:p>
+    <w:p>
+      <w:r>
+        <w:rPr/>
+        <w:t xml:space="preserve">Un puntatore occupa memoria come ogni variabile, ma la sua dimensione dipende dalla </w:t>
+      </w:r>
+      <w:r>
+        <w:rPr>
+          <w:b/>
+        </w:rPr>
+        <w:t>piattaforma</w:t>
+      </w:r>
+      <w:r>
+        <w:rPr/>
+        <w:t xml:space="preserve"> e non dalla dimensione del tipo puntato. Su una tipica CPU a 64 bit un puntatore occupa 8 byte, su una tipica CPU a 32 bit 4 byte:</w:t>
+      </w:r>
+    </w:p>
+    <w:p>
+      <w:pPr>
+        <w:spacing w:after="0" w:before="0" w:line="240" w:lineRule="auto"/>
+      </w:pPr>
+      <w:r>
+        <w:rPr>
+          <w:rFonts w:ascii="Consolas" w:hAnsi="Consolas" w:cs="Consolas"/>
+          <w:sz w:val="17"/>
+        </w:rPr>
+        <w:t>int x;</w:t>
+      </w:r>
+    </w:p>
+    <w:p>
+      <w:pPr>
+        <w:spacing w:after="0" w:before="0" w:line="240" w:lineRule="auto"/>
+      </w:pPr>
+      <w:r>
+        <w:rPr>
+          <w:rFonts w:ascii="Consolas" w:hAnsi="Consolas" w:cs="Consolas"/>
+          <w:sz w:val="17"/>
+        </w:rPr>
+        <w:t>int* pX;</w:t>
+      </w:r>
+    </w:p>
+    <w:p>
+      <w:pPr>
+        <w:spacing w:after="0" w:before="0" w:line="240" w:lineRule="auto"/>
+      </w:pPr>
+      <w:r>
+        <w:rPr>
+          <w:rFonts w:ascii="Consolas" w:hAnsi="Consolas" w:cs="Consolas"/>
+          <w:sz w:val="17"/>
+        </w:rPr>
+        <w:t>printf("sizeof(x) %zu B\n", sizeof(x));   // 4 B</w:t>
+      </w:r>
+    </w:p>
+    <w:p>
+      <w:pPr>
+        <w:spacing w:after="0" w:before="0" w:line="240" w:lineRule="auto"/>
+      </w:pPr>
+      <w:r>
+        <w:rPr>
+          <w:rFonts w:ascii="Consolas" w:hAnsi="Consolas" w:cs="Consolas"/>
+          <w:sz w:val="17"/>
+        </w:rPr>
+        <w:t>printf("sizeof(pX) %zu B\n", sizeof(pX));  // 8 B su piattaforma a 64 bit</w:t>
+      </w:r>
+    </w:p>
+    <w:p/>
+    <w:p>
+      <w:pPr>
+        <w:pStyle w:val="Titolo2"/>
+      </w:pPr>
+      <w:r>
+        <w:rPr>
+          <w:b/>
+          <w:color w:val="E97132"/>
+        </w:rPr>
+        <w:t>&amp; e * sono operazioni complementari</w:t>
+      </w:r>
+    </w:p>
+    <w:p>
+      <w:r>
+        <w:rPr/>
+        <w:t>Se int a = 7; e int* pA = &amp;a;, allora l'indirizzo di a, il valore di pA, &amp;*pA e *&amp;pA coincidono, mentre a e *pA valgono entrambi 7: gli operatori &amp; e * si "annullano" a vicenda.</w:t>
+      </w:r>
+    </w:p>
+    <w:p>
+      <w:pPr>
+        <w:pStyle w:val="Titolo2"/>
+      </w:pPr>
+      <w:r>
+        <w:rPr>
+          <w:b/>
+          <w:color w:val="E97132"/>
+        </w:rPr>
+        <w:t>I diversi usi del simbolo *</w:t>
+      </w:r>
+    </w:p>
+    <w:p>
+      <w:r>
+        <w:rPr/>
+        <w:t>Il simbolo * (</w:t>
+      </w:r>
+      <w:r>
+        <w:rPr>
+          <w:i/>
+        </w:rPr>
+        <w:t>star</w:t>
+      </w:r>
+      <w:r>
+        <w:rPr/>
+        <w:t>) si usa in C con quattro significati:</w:t>
+      </w:r>
+    </w:p>
+    <w:p>
+      <w:r>
+        <w:rPr/>
+        <w:t xml:space="preserve">1. operatore di </w:t>
+      </w:r>
+      <w:r>
+        <w:rPr>
+          <w:b/>
+        </w:rPr>
+        <w:t>moltiplicazione</w:t>
+      </w:r>
+      <w:r>
+        <w:rPr/>
+        <w:t>: int x = a * b;</w:t>
+      </w:r>
+    </w:p>
+    <w:p>
+      <w:r>
+        <w:rPr/>
+        <w:t xml:space="preserve">2. </w:t>
+      </w:r>
+      <w:r>
+        <w:rPr>
+          <w:b/>
+        </w:rPr>
+        <w:t>dichiarazione</w:t>
+      </w:r>
+      <w:r>
+        <w:rPr/>
+        <w:t xml:space="preserve"> di una variabile di tipo puntatore: int* pX = &amp;x;</w:t>
+      </w:r>
+    </w:p>
+    <w:p>
+      <w:r>
+        <w:rPr/>
+        <w:t xml:space="preserve">3. </w:t>
+      </w:r>
+      <w:r>
+        <w:rPr>
+          <w:b/>
+        </w:rPr>
+        <w:t>dereferenziamento</w:t>
+      </w:r>
+      <w:r>
+        <w:rPr/>
+        <w:t xml:space="preserve"> di un puntatore: int x = *pX;</w:t>
+      </w:r>
+    </w:p>
+    <w:p>
+      <w:r>
+        <w:rPr/>
+        <w:t xml:space="preserve">4. </w:t>
+      </w:r>
+      <w:r>
+        <w:rPr>
+          <w:b/>
+        </w:rPr>
+        <w:t>puntatore a puntatore</w:t>
+      </w:r>
+      <w:r>
+        <w:rPr/>
+        <w:t xml:space="preserve"> (non trattato nel corso): int** ppX = &amp;pX; pX = *ppX; **ppX = 10;</w:t>
+      </w:r>
+    </w:p>
+    <w:p>
+      <w:r>
+        <w:rPr/>
+        <w:t>Distinguere il contesto in cui compare l'asterisco è il modo per non confondere questi usi. I puntatori sono la base per gestire la memoria dinamica, le strutture dati complesse e la comunicazione efficiente tra funzioni.</w:t>
       </w:r>
     </w:p>
     <w:sectPr>

</xml_diff>